<commit_message>
Rebuild consultation page as six-section visa-prep form
- Six sections (passport, study plans, education, work,
  funds/statements, other) with only essential fields each
- Intended-level select: language/pathway, diploma, bachelor,
  graduate diploma, master's, other
- Contact email and disclaimer shown on the consultation page;
  Word file still generated client-side via docx, never uploaded
- Align generateConsultDoc and the sample preview script with the
  trimmed field set
- Tests: assert routes change the URL, direct-URL loads work,
  404 page renders, homepage stays form-free

Co-authored-by: Min Chen <chenmin911130@gmail.com>
</commit_message>
<xml_diff>
--- a/public/samples/点点新西兰留学咨询-签证信息表-示例.docx
+++ b/public/samples/点点新西兰留学咨询-签证信息表-示例.docx
@@ -97,21 +97,6 @@
           <w:b/>
           <w:bCs/>
         </w:rPr>
-        <w:t xml:space="preserve">国籍：</w:t>
-      </w:r>
-      <w:r>
-        <w:t xml:space="preserve">中国</w:t>
-      </w:r>
-    </w:p>
-    <w:p>
-      <w:pPr>
-        <w:spacing w:after="120"/>
-      </w:pPr>
-      <w:r>
-        <w:rPr>
-          <w:b/>
-          <w:bCs/>
-        </w:rPr>
         <w:t xml:space="preserve">护照号码：</w:t>
       </w:r>
       <w:r>
@@ -142,25 +127,10 @@
           <w:b/>
           <w:bCs/>
         </w:rPr>
-        <w:t xml:space="preserve">手机：</w:t>
-      </w:r>
-      <w:r>
-        <w:t xml:space="preserve">13800138000</w:t>
-      </w:r>
-    </w:p>
-    <w:p>
-      <w:pPr>
-        <w:spacing w:after="120"/>
-      </w:pPr>
-      <w:r>
-        <w:rPr>
-          <w:b/>
-          <w:bCs/>
-        </w:rPr>
-        <w:t xml:space="preserve">微信：</w:t>
-      </w:r>
-      <w:r>
-        <w:t xml:space="preserve">zs_nz2026</w:t>
+        <w:t xml:space="preserve">手机 / 微信：</w:t>
+      </w:r>
+      <w:r>
+        <w:t xml:space="preserve">13800138000 / zs_nz2026</w:t>
       </w:r>
     </w:p>
     <w:p>
@@ -200,6 +170,21 @@
           <w:b/>
           <w:bCs/>
         </w:rPr>
+        <w:t xml:space="preserve">意向学历：</w:t>
+      </w:r>
+      <w:r>
+        <w:t xml:space="preserve">专科 / Diploma</w:t>
+      </w:r>
+    </w:p>
+    <w:p>
+      <w:pPr>
+        <w:spacing w:after="120"/>
+      </w:pPr>
+      <w:r>
+        <w:rPr>
+          <w:b/>
+          <w:bCs/>
+        </w:rPr>
         <w:t xml:space="preserve">意向学校：</w:t>
       </w:r>
       <w:r>
@@ -215,21 +200,6 @@
           <w:b/>
           <w:bCs/>
         </w:rPr>
-        <w:t xml:space="preserve">意向学历：</w:t>
-      </w:r>
-      <w:r>
-        <w:t xml:space="preserve">专科 / Diploma</w:t>
-      </w:r>
-    </w:p>
-    <w:p>
-      <w:pPr>
-        <w:spacing w:after="120"/>
-      </w:pPr>
-      <w:r>
-        <w:rPr>
-          <w:b/>
-          <w:bCs/>
-        </w:rPr>
         <w:t xml:space="preserve">意向专业 / 课程：</w:t>
       </w:r>
       <w:r>
@@ -279,21 +249,6 @@
       </w:r>
       <w:r>
         <w:t xml:space="preserve">否</w:t>
-      </w:r>
-    </w:p>
-    <w:p>
-      <w:pPr>
-        <w:spacing w:after="120"/>
-      </w:pPr>
-      <w:r>
-        <w:rPr>
-          <w:b/>
-          <w:bCs/>
-        </w:rPr>
-        <w:t xml:space="preserve">咨询方向：</w:t>
-      </w:r>
-      <w:r>
-        <w:t xml:space="preserve">选校 / School choice、签证 / Visa</w:t>
       </w:r>
     </w:p>
     <w:p>
@@ -333,7 +288,7 @@
           <w:b/>
           <w:bCs/>
         </w:rPr>
-        <w:t xml:space="preserve">学校：</w:t>
+        <w:t xml:space="preserve">毕业院校：</w:t>
       </w:r>
       <w:r>
         <w:t xml:space="preserve">某某大学</w:t>
@@ -352,26 +307,6 @@
       </w:r>
       <w:r>
         <w:t xml:space="preserve">会计学</w:t>
-      </w:r>
-    </w:p>
-    <w:p>
-      <w:pPr>
-        <w:spacing w:after="60" w:before="80"/>
-      </w:pPr>
-      <w:r>
-        <w:rPr>
-          <w:b/>
-          <w:bCs/>
-        </w:rPr>
-        <w:t xml:space="preserve">学历时间线：</w:t>
-      </w:r>
-    </w:p>
-    <w:p>
-      <w:pPr>
-        <w:spacing w:after="140"/>
-      </w:pPr>
-      <w:r>
-        <w:t xml:space="preserve">2016–2020 某某大学 本科 会计学</w:t>
       </w:r>
     </w:p>
     <w:p>
@@ -411,25 +346,10 @@
           <w:b/>
           <w:bCs/>
         </w:rPr>
-        <w:t xml:space="preserve">单位：</w:t>
-      </w:r>
-      <w:r>
-        <w:t xml:space="preserve">某某贸易有限公司</w:t>
-      </w:r>
-    </w:p>
-    <w:p>
-      <w:pPr>
-        <w:spacing w:after="120"/>
-      </w:pPr>
-      <w:r>
-        <w:rPr>
-          <w:b/>
-          <w:bCs/>
-        </w:rPr>
-        <w:t xml:space="preserve">职位：</w:t>
-      </w:r>
-      <w:r>
-        <w:t xml:space="preserve">销售专员</w:t>
+        <w:t xml:space="preserve">单位 / 职位：</w:t>
+      </w:r>
+      <w:r>
+        <w:t xml:space="preserve">某某贸易有限公司 / 销售专员</w:t>
       </w:r>
     </w:p>
     <w:p>
@@ -445,26 +365,6 @@
       </w:r>
       <w:r>
         <w:t xml:space="preserve">8000</w:t>
-      </w:r>
-    </w:p>
-    <w:p>
-      <w:pPr>
-        <w:spacing w:after="60" w:before="80"/>
-      </w:pPr>
-      <w:r>
-        <w:rPr>
-          <w:b/>
-          <w:bCs/>
-        </w:rPr>
-        <w:t xml:space="preserve">工作经历：</w:t>
-      </w:r>
-    </w:p>
-    <w:p>
-      <w:pPr>
-        <w:spacing w:after="140"/>
-      </w:pPr>
-      <w:r>
-        <w:t xml:space="preserve">2020.07–至今 某某贸易有限公司 销售专员</w:t>
       </w:r>
     </w:p>
     <w:p>
@@ -504,40 +404,10 @@
           <w:b/>
           <w:bCs/>
         </w:rPr>
-        <w:t xml:space="preserve">担保人姓名：</w:t>
-      </w:r>
-      <w:r>
-        <w:t xml:space="preserve">张父</w:t>
-      </w:r>
-    </w:p>
-    <w:p>
-      <w:pPr>
-        <w:spacing w:after="120"/>
-      </w:pPr>
-      <w:r>
-        <w:rPr>
-          <w:b/>
-          <w:bCs/>
-        </w:rPr>
-        <w:t xml:space="preserve">与申请人关系：</w:t>
-      </w:r>
-      <w:r>
-        <w:t xml:space="preserve">父亲</w:t>
-      </w:r>
-    </w:p>
-    <w:p>
-      <w:pPr>
-        <w:spacing w:after="120"/>
-      </w:pPr>
-      <w:r>
-        <w:rPr>
-          <w:b/>
-          <w:bCs/>
-        </w:rPr>
-        <w:t xml:space="preserve">担保人年收入（人民币）：</w:t>
-      </w:r>
-      <w:r>
-        <w:t xml:space="preserve">25万</w:t>
+        <w:t xml:space="preserve">担保人 / 关系：</w:t>
+      </w:r>
+      <w:r>
+        <w:t xml:space="preserve">张父 / 父亲</w:t>
       </w:r>
     </w:p>
     <w:p>
@@ -553,21 +423,6 @@
       </w:r>
       <w:r>
         <w:t xml:space="preserve">28万人民币</w:t>
-      </w:r>
-    </w:p>
-    <w:p>
-      <w:pPr>
-        <w:spacing w:after="120"/>
-      </w:pPr>
-      <w:r>
-        <w:rPr>
-          <w:b/>
-          <w:bCs/>
-        </w:rPr>
-        <w:t xml:space="preserve">开户银行：</w:t>
-      </w:r>
-      <w:r>
-        <w:t xml:space="preserve">中国银行</w:t>
       </w:r>
     </w:p>
     <w:p>
@@ -690,7 +545,7 @@
           <w:sz w:val="18"/>
           <w:szCs w:val="18"/>
         </w:rPr>
-        <w:t xml:space="preserve">材料提醒：请另附学历证明、在职/收入证明、存款证明、银行流水扫描件。本文件由点点新西兰留学咨询网站在客户浏览器本地生成，未上传至服务器。</w:t>
+        <w:t xml:space="preserve">材料提醒：如需继续沟通，请将此 Word 文件发送至 yuditawang0925@gmail.com。请另附学历证明、在职/收入证明、存款证明、银行流水扫描件。本文件由点点新西兰留学咨询网站在客户浏览器本地生成，未上传至服务器。本站内容仅为一般信息，不构成持牌移民法律建议。</w:t>
       </w:r>
     </w:p>
     <w:sectPr>

</xml_diff>

<commit_message>
Ship the Wanaka lake-blue site and shorten the consult form.
Replace the coast hero with a still Wanaka landscape, restyle chrome in lake blue, keep the tree out of the page background, and drop funds and other-visa sections from the consult form.

Co-authored-by: Cursor <cursoragent@cursor.com>
</commit_message>
<xml_diff>
--- a/public/samples/点点新西兰留学咨询-签证信息表-示例.docx
+++ b/public/samples/点点新西兰留学咨询-签证信息表-示例.docx
@@ -365,172 +365,6 @@
       </w:r>
       <w:r>
         <w:t xml:space="preserve">8000</w:t>
-      </w:r>
-    </w:p>
-    <w:p>
-      <w:pPr>
-        <w:pStyle w:val="Heading2"/>
-        <w:spacing w:after="160" w:before="280"/>
-      </w:pPr>
-      <w:r>
-        <w:rPr>
-          <w:b/>
-          <w:bCs/>
-        </w:rPr>
-        <w:t xml:space="preserve">5. 资金证明：收入、存款与流水</w:t>
-      </w:r>
-    </w:p>
-    <w:p>
-      <w:pPr>
-        <w:spacing w:after="120"/>
-      </w:pPr>
-      <w:r>
-        <w:rPr>
-          <w:b/>
-          <w:bCs/>
-        </w:rPr>
-        <w:t xml:space="preserve">资金来源：</w:t>
-      </w:r>
-      <w:r>
-        <w:t xml:space="preserve">父母资助</w:t>
-      </w:r>
-    </w:p>
-    <w:p>
-      <w:pPr>
-        <w:spacing w:after="120"/>
-      </w:pPr>
-      <w:r>
-        <w:rPr>
-          <w:b/>
-          <w:bCs/>
-        </w:rPr>
-        <w:t xml:space="preserve">担保人 / 关系：</w:t>
-      </w:r>
-      <w:r>
-        <w:t xml:space="preserve">张父 / 父亲</w:t>
-      </w:r>
-    </w:p>
-    <w:p>
-      <w:pPr>
-        <w:spacing w:after="120"/>
-      </w:pPr>
-      <w:r>
-        <w:rPr>
-          <w:b/>
-          <w:bCs/>
-        </w:rPr>
-        <w:t xml:space="preserve">存款总额：</w:t>
-      </w:r>
-      <w:r>
-        <w:t xml:space="preserve">28万人民币</w:t>
-      </w:r>
-    </w:p>
-    <w:p>
-      <w:pPr>
-        <w:spacing w:after="120"/>
-      </w:pPr>
-      <w:r>
-        <w:rPr>
-          <w:b/>
-          <w:bCs/>
-        </w:rPr>
-        <w:t xml:space="preserve">可提供流水月份：</w:t>
-      </w:r>
-      <w:r>
-        <w:t xml:space="preserve">近12个月</w:t>
-      </w:r>
-    </w:p>
-    <w:p>
-      <w:pPr>
-        <w:spacing w:after="60" w:before="80"/>
-      </w:pPr>
-      <w:r>
-        <w:rPr>
-          <w:b/>
-          <w:bCs/>
-        </w:rPr>
-        <w:t xml:space="preserve">大额进账说明：</w:t>
-      </w:r>
-    </w:p>
-    <w:p>
-      <w:pPr>
-        <w:spacing w:after="140"/>
-      </w:pPr>
-      <w:r>
-        <w:t xml:space="preserve">每月工资入账；2025年3月父母转入学费准备金约15万</w:t>
-      </w:r>
-    </w:p>
-    <w:p>
-      <w:pPr>
-        <w:pStyle w:val="Heading2"/>
-        <w:spacing w:after="160" w:before="280"/>
-      </w:pPr>
-      <w:r>
-        <w:rPr>
-          <w:b/>
-          <w:bCs/>
-        </w:rPr>
-        <w:t xml:space="preserve">6. 其他签证相关</w:t>
-      </w:r>
-    </w:p>
-    <w:p>
-      <w:pPr>
-        <w:spacing w:after="60" w:before="80"/>
-      </w:pPr>
-      <w:r>
-        <w:rPr>
-          <w:b/>
-          <w:bCs/>
-        </w:rPr>
-        <w:t xml:space="preserve">出国 / 旅行记录：</w:t>
-      </w:r>
-    </w:p>
-    <w:p>
-      <w:pPr>
-        <w:spacing w:after="140"/>
-      </w:pPr>
-      <w:r>
-        <w:t xml:space="preserve">无</w:t>
-      </w:r>
-    </w:p>
-    <w:p>
-      <w:pPr>
-        <w:spacing w:after="60" w:before="80"/>
-      </w:pPr>
-      <w:r>
-        <w:rPr>
-          <w:b/>
-          <w:bCs/>
-        </w:rPr>
-        <w:t xml:space="preserve">拒签史：</w:t>
-      </w:r>
-    </w:p>
-    <w:p>
-      <w:pPr>
-        <w:spacing w:after="140"/>
-      </w:pPr>
-      <w:r>
-        <w:t xml:space="preserve">无</w:t>
-      </w:r>
-    </w:p>
-    <w:p>
-      <w:pPr>
-        <w:spacing w:after="60" w:before="80"/>
-      </w:pPr>
-      <w:r>
-        <w:rPr>
-          <w:b/>
-          <w:bCs/>
-        </w:rPr>
-        <w:t xml:space="preserve">补充说明：</w:t>
-      </w:r>
-    </w:p>
-    <w:p>
-      <w:pPr>
-        <w:spacing w:after="140"/>
-      </w:pPr>
-      <w:r>
-        <w:t xml:space="preserve">希望优先对比 ICL 与 AIS 的学费与课程</w:t>
       </w:r>
     </w:p>
     <w:p>
@@ -545,7 +379,7 @@
           <w:sz w:val="18"/>
           <w:szCs w:val="18"/>
         </w:rPr>
-        <w:t xml:space="preserve">材料提醒：如需继续沟通，请将此 Word 文件发送至 yuditawang0925@gmail.com。请另附学历证明、在职/收入证明、存款证明、银行流水扫描件。本文件由点点新西兰留学咨询网站在客户浏览器本地生成，未上传至服务器。本站内容仅为一般信息，不构成持牌移民法律建议。</w:t>
+        <w:t xml:space="preserve">材料提醒：如需继续沟通，请将此 Word 文件发送至 yuditawang0925@gmail.com。如有学历或在职证明扫描件可一并附上。本文件由点点新西兰留学咨询网站在客户浏览器本地生成，未上传至服务器。本站内容仅为一般信息，不构成持牌移民法律建议。</w:t>
       </w:r>
     </w:p>
     <w:sectPr>

</xml_diff>